<commit_message>
Update bug document with stale-timer fix and Playwright verification
</commit_message>
<xml_diff>
--- a/Battleship_Bugs_Fixed.docx
+++ b/Battleship_Bugs_Fixed.docx
@@ -414,6 +414,59 @@
     </w:p>
     <w:p>
       <w:pPr>
+        <w:pStyle w:val="Heading2"/>
+      </w:pPr>
+      <w:r>
+        <w:rPr>
+          <w:color w:val="007ACC"/>
+        </w:rPr>
+        <w:t>8b. Stale AI timer caused a false "You Lost" after restart</w:t>
+      </w:r>
+    </w:p>
+    <w:p>
+      <w:pPr>
+        <w:pStyle w:val="ListBullet"/>
+      </w:pPr>
+      <w:r>
+        <w:rPr>
+          <w:b/>
+        </w:rPr>
+        <w:t xml:space="preserve">Symptom: </w:t>
+      </w:r>
+      <w:r>
+        <w:t>Clicking "New Game" during the AI’s 1-second delay could pop a "You Lost!" screen over the fresh setup a moment later.</w:t>
+      </w:r>
+    </w:p>
+    <w:p>
+      <w:pPr>
+        <w:pStyle w:val="ListBullet"/>
+      </w:pPr>
+      <w:r>
+        <w:rPr>
+          <w:b/>
+        </w:rPr>
+        <w:t xml:space="preserve">Cause: </w:t>
+      </w:r>
+      <w:r>
+        <w:t>The pending AI-turn timer still fired after the board was reset, then attacked an empty board where the player had no ships — tripping the loss condition.</w:t>
+      </w:r>
+    </w:p>
+    <w:p>
+      <w:pPr>
+        <w:pStyle w:val="ListBullet"/>
+      </w:pPr>
+      <w:r>
+        <w:rPr>
+          <w:b/>
+        </w:rPr>
+        <w:t xml:space="preserve">Fix: </w:t>
+      </w:r>
+      <w:r>
+        <w:t>The AI timer is now tracked and cancelled on reset, and the AI turn bails out early if no game is active. Verified with an automated test.</w:t>
+      </w:r>
+    </w:p>
+    <w:p>
+      <w:pPr>
         <w:pStyle w:val="Heading1"/>
       </w:pPr>
       <w:r>
@@ -539,7 +592,10 @@
     </w:p>
     <w:p>
       <w:r>
-        <w:t>Beyond manual play-testing, the logic was checked with automated tests run in a JavaScript engine (jsc) using a DOM stub:</w:t>
+        <w:rPr>
+          <w:b/>
+        </w:rPr>
+        <w:t xml:space="preserve">Logic tests (JavaScript engine, DOM-stubbed): </w:t>
       </w:r>
     </w:p>
     <w:p>
@@ -603,7 +659,55 @@
         <w:rPr>
           <w:b/>
         </w:rPr>
-        <w:t>All checks passed.</w:t>
+        <w:t xml:space="preserve">Browser UI tests (Playwright, Chromium + Firefox): </w:t>
+      </w:r>
+    </w:p>
+    <w:p>
+      <w:pPr>
+        <w:pStyle w:val="ListBullet"/>
+      </w:pPr>
+      <w:r>
+        <w:t>Places all ships through the UI and starts a game</w:t>
+      </w:r>
+    </w:p>
+    <w:p>
+      <w:pPr>
+        <w:pStyle w:val="ListBullet"/>
+      </w:pPr>
+      <w:r>
+        <w:t>Player can win by clicking every AI ship cell</w:t>
+      </w:r>
+    </w:p>
+    <w:p>
+      <w:pPr>
+        <w:pStyle w:val="ListBullet"/>
+      </w:pPr>
+      <w:r>
+        <w:t>Re-attacking the same cell is rejected</w:t>
+      </w:r>
+    </w:p>
+    <w:p>
+      <w:pPr>
+        <w:pStyle w:val="ListBullet"/>
+      </w:pPr>
+      <w:r>
+        <w:t>R key rotates a ship to vertical placement</w:t>
+      </w:r>
+    </w:p>
+    <w:p>
+      <w:pPr>
+        <w:pStyle w:val="ListBullet"/>
+      </w:pPr>
+      <w:r>
+        <w:t>Restarting during the AI delay does not cause a false loss</w:t>
+      </w:r>
+    </w:p>
+    <w:p>
+      <w:r>
+        <w:rPr>
+          <w:b/>
+        </w:rPr>
+        <w:t>All checks passed (10 browser tests across 2 engines, plus the logic suites).</w:t>
       </w:r>
     </w:p>
     <w:sectPr>

</xml_diff>